<commit_message>
Polish IJTB manuscript language
</commit_message>
<xml_diff>
--- a/submission_ready/ijtb_20260317/02_IJTB_Blinded_Manuscript.docx
+++ b/submission_ready/ijtb_20260317/02_IJTB_Blinded_Manuscript.docx
@@ -275,12 +275,12 @@
     </w:p>
     <w:p>
       <w:r>
-        <w:t>The processed cohorts were not fully interchangeable. Only two cohorts provided directly comparable binary labels for the main leave-one-cohort-out analysis. That limitation is important because it sets the true boundary of the current evidence and prevents overstatement of the model's maturity.</w:t>
+        <w:t>The processed cohorts were not fully interchangeable. Only two cohorts provided directly comparable binary labels for the main leave-one-cohort-out analysis. That limitation defines the real boundary of the current evidence and helps prevent overstatement of model maturity.</w:t>
       </w:r>
     </w:p>
     <w:p>
       <w:r>
-        <w:t>The cohort mix still has value because it reflects the real structure of the public tuberculosis transcriptomic literature. Some studies are rich in biological context but less clean for direct binary validation, while others are more suitable for classifier testing. Treating these cohorts as if they were analytically identical would create artificial precision. The present workflow instead preserves that distinction and uses it to guide how far the manuscript can reasonably interpret the results.</w:t>
+        <w:t>The cohort mix nevertheless remains informative because it reflects the actual structure of the public tuberculosis transcriptomic literature. Some studies are rich in biological context but less suitable for direct binary validation, whereas others are better suited to classifier testing. Treating these cohorts as analytically identical would create false precision. The present workflow preserves that distinction and uses it to guide how far the results can reasonably be interpreted.</w:t>
       </w:r>
     </w:p>
     <w:p>
@@ -298,12 +298,12 @@
     </w:p>
     <w:p>
       <w:r>
-        <w:t>The top-ranked genes were biologically coherent rather than statistically isolated. MILR1 and IRAK3 suggest regulatory signaling, CCR2 and ITGB2 support immune-cell recruitment, CD36 reflects macrophage-associated lipid and scavenger biology, and FZD5 points to a broader signaling context that may relate to tissue remodeling and inflammatory balance. The forest summary of top transcriptomic effects is shown in Fig. 1.</w:t>
+        <w:t>The top-ranked genes were biologically coherent rather than statistically isolated. MILR1 and IRAK3 suggest regulatory signaling, CCR2 and ITGB2 support immune-cell recruitment, CD36 reflects macrophage-associated lipid and scavenger biology, and FZD5 points to a broader signaling context that may relate to tissue remodeling and inflammatory balance. A forest-style summary of the leading transcriptomic effects is shown in Fig. 1.</w:t>
       </w:r>
     </w:p>
     <w:p>
       <w:r>
-        <w:t>The leading genes also showed a useful balance between effect size and interpretability. For a translational manuscript, it is not enough for genes to rank highly; they should also map to host processes that clinicians and laboratory scientists can understand. In that respect, the current list is more persuasive than a purely opaque machine-learning feature set because it links progression to recognizable pathways in myeloid activation, adhesion, and immune regulation.</w:t>
+        <w:t>The leading genes also showed a practical balance between effect size and interpretability. For a translational study, it is not enough for genes to rank highly; they should also map to host processes that clinicians and laboratory scientists can understand. In that sense, the current list is more convincing than an opaque machine-learning feature set because it links progression to recognizable pathways in myeloid activation, adhesion, and immune regulation.</w:t>
       </w:r>
     </w:p>
     <w:p>
@@ -321,12 +321,12 @@
     </w:p>
     <w:p>
       <w:r>
-        <w:t>The results also showed that discrimination and calibration were not equivalent. The gene-set-score model ranked samples best, but linear support vector machine achieved more favorable Brier scores. This pattern suggests that the host signal is strong enough for cross-cohort discrimination, while absolute risk estimation remains less mature. The ROC comparison is presented in Fig. 2.</w:t>
+        <w:t>The results also showed that discrimination and calibration were not equivalent. The gene-set-score model ranked samples best, whereas linear support vector machine achieved more favorable Brier scores. This pattern suggests that the host signal is strong enough for cross-cohort discrimination, while absolute risk estimation remains less mature. The ROC comparison is presented in Fig. 2.</w:t>
       </w:r>
     </w:p>
     <w:p>
       <w:r>
-        <w:t>The difference between the held-out cohorts is also informative. A signature that performs identically in every public cohort is uncommon in this field, partly because cohorts differ in baseline risk, recruitment frame, timing of sampling, and assay processing. The observed variation therefore does not invalidate the signature; instead, it highlights why strict external testing is necessary before any host transcriptomic model is presented as clinically stable.</w:t>
+        <w:t>The difference between the held-out cohorts is also informative. A signature that performs identically in every public cohort is uncommon in this field because cohorts differ in baseline risk, recruitment frame, sampling window, and assay processing. The observed variation therefore does not invalidate the signature; instead, it underlines why strict external testing is necessary before any host transcriptomic model is presented as clinically stable.</w:t>
       </w:r>
     </w:p>
     <w:p>
@@ -355,7 +355,7 @@
     </w:p>
     <w:p>
       <w:r>
-        <w:t>This interpretation is clinically useful because it avoids a simplistic view in which progression is reduced to 'more inflammation'. The enrichment profile instead suggests a more complex biological state in which recruitment, regulation, phagocytic behavior, and tissue-level adaptation are all changing together. That framing is easier to defend scientifically and easier to communicate to a broad tuberculosis readership.</w:t>
+        <w:t>This interpretation is clinically useful because it avoids a simplistic view in which progression is reduced to 'more inflammation'. The enrichment profile instead suggests a more complex biological state in which recruitment, regulation, phagocytic behavior, and tissue-level adaptation change together. That framing is easier to defend scientifically and easier to communicate to a broad tuberculosis readership.</w:t>
       </w:r>
     </w:p>
     <w:p>
@@ -387,7 +387,7 @@
         <w:t>3-5</w:t>
       </w:r>
       <w:r>
-        <w:t xml:space="preserve"> The present analysis adds value by prioritizing reproducibility, simple reporting, and cohort-held-out validation.</w:t>
+        <w:t xml:space="preserve"> The present analysis adds value by prioritizing reproducibility, clear reporting, and cohort-held-out validation.</w:t>
       </w:r>
     </w:p>
     <w:p>
@@ -417,7 +417,7 @@
     </w:p>
     <w:p>
       <w:r>
-        <w:t>Even with those limitations, the study remains useful. It identifies a biologically interpretable candidate gene set, demonstrates that cross-cohort signal retention is achievable, and provides a reproducible submission package that can be updated as more progression-ready cohorts are integrated.</w:t>
+        <w:t>Even with these limitations, the study remains useful. It identifies a biologically interpretable candidate gene set, demonstrates that cross-cohort signal retention is achievable, and provides a reproducible submission package that can be updated as more progression-ready cohorts are integrated.</w:t>
       </w:r>
     </w:p>
     <w:p>

</xml_diff>